<commit_message>
docs: đổi 'Viện Kỹ thuật HUTECH' → 'Khoa Công nghệ Thông tin' toàn bộ
Rà soát & thay thế tại 2 script và 5 file .docx output:
- VIỆN KỸ THUẬT HUTECH (header phiếu, cover bìa) → KHOA CÔNG NGHỆ THÔNG TIN
- Viện Kỹ thuật HUTECH (trong nội dung) → Khoa Công nghệ Thông tin
- "của Viện đã trang bị..." → "của Khoa đã trang bị..."

Giữ nguyên 'HUTECH' đứng độc lập (tên trường: Trường ĐH Công nghệ TP.HCM
(HUTECH)) và các comment nội bộ "theo mẫu HUTECH".
</commit_message>
<xml_diff>
--- a/docs/PHIEU_GIAO_DE_TAI.docx
+++ b/docs/PHIEU_GIAO_DE_TAI.docx
@@ -13,7 +13,7 @@
           <w:i w:val="0"/>
           <w:sz w:val="26"/>
         </w:rPr>
-        <w:t>VIỆN KỸ THUẬT HUTECH</w:t>
+        <w:t>KHOA CÔNG NGHỆ THÔNG TIN</w:t>
       </w:r>
     </w:p>
     <w:p>
@@ -373,7 +373,7 @@
           <w:i w:val="0"/>
           <w:sz w:val="26"/>
         </w:rPr>
-        <w:t>4) Báo cáo đồ án đầy đủ theo mẫu của Viện Kỹ thuật HUTECH.</w:t>
+        <w:t>4) Báo cáo đồ án đầy đủ theo mẫu của Khoa Công nghệ Thông tin.</w:t>
       </w:r>
     </w:p>
     <w:p>

</xml_diff>